<commit_message>
:lipstick: alterar numero de telefone em requisitos funcionais RN17
</commit_message>
<xml_diff>
--- a/Documento de Requisitos de Software 6 Semestre.docx
+++ b/Documento de Requisitos de Software 6 Semestre.docx
@@ -14142,6 +14142,28 @@
                 <w:szCs w:val="24"/>
               </w:rPr>
               <w:t>Data de aniversário</w:t>
+            </w:r>
+          </w:p>
+          <w:p>
+            <w:pPr>
+              <w:pStyle w:val="PargrafodaLista"/>
+              <w:numPr>
+                <w:ilvl w:val="0"/>
+                <w:numId w:val="12"/>
+              </w:numPr>
+              <w:rPr>
+                <w:rFonts w:ascii="Arial" w:eastAsiaTheme="minorHAnsi" w:hAnsi="Arial" w:cs="Arial"/>
+                <w:sz w:val="20"/>
+                <w:szCs w:val="24"/>
+              </w:rPr>
+            </w:pPr>
+            <w:r>
+              <w:rPr>
+                <w:rFonts w:ascii="Arial" w:eastAsiaTheme="minorHAnsi" w:hAnsi="Arial" w:cs="Arial"/>
+                <w:sz w:val="20"/>
+                <w:szCs w:val="24"/>
+              </w:rPr>
+              <w:t>Número de celular</w:t>
             </w:r>
           </w:p>
           <w:p>

</xml_diff>